<commit_message>
Actualizacion de docs y pdf
Se actualizo correctamente los documentos del deber TDA-CORONAVIRUS
</commit_message>
<xml_diff>
--- a/docs/Informe_TDA_Coronavirus.docx/TDA_Coronavirus.docx
+++ b/docs/Informe_TDA_Coronavirus.docx/TDA_Coronavirus.docx
@@ -237,48 +237,40 @@
         <w:tab/>
       </w:r>
       <w:r>
-        <w:rPr>
-          <w:rFonts w:ascii="Times New Roman" w:hAnsi="Times New Roman"/>
-        </w:rPr>
-        <w:t xml:space="preserve">Camacho Monta </w:t>
+        <w:t xml:space="preserve"> </w:t>
+      </w:r>
+      <w:r>
+        <w:rPr>
+          <w:rFonts w:ascii="Times New Roman" w:hAnsi="Times New Roman"/>
+        </w:rPr>
+        <w:t>Camacho Monta Josue Jampier</w:t>
+      </w:r>
+    </w:p>
+    <w:p>
+      <w:pPr>
+        <w:spacing w:after="0" w:line="240" w:lineRule="auto"/>
+        <w:rPr>
+          <w:rFonts w:ascii="Times New Roman" w:hAnsi="Times New Roman"/>
+        </w:rPr>
+      </w:pPr>
+      <w:r>
+        <w:rPr>
+          <w:rFonts w:ascii="Times New Roman" w:hAnsi="Times New Roman"/>
+        </w:rPr>
+        <w:t xml:space="preserve">                                                                 Chalco </w:t>
       </w:r>
       <w:proofErr w:type="spellStart"/>
       <w:r>
         <w:rPr>
           <w:rFonts w:ascii="Times New Roman" w:hAnsi="Times New Roman"/>
         </w:rPr>
-        <w:t>Josue</w:t>
+        <w:t>Tasna</w:t>
       </w:r>
       <w:proofErr w:type="spellEnd"/>
       <w:r>
         <w:rPr>
           <w:rFonts w:ascii="Times New Roman" w:hAnsi="Times New Roman"/>
         </w:rPr>
-        <w:t xml:space="preserve"> Jampier</w:t>
-      </w:r>
-    </w:p>
-    <w:p>
-      <w:pPr>
-        <w:spacing w:after="0" w:line="240" w:lineRule="auto"/>
-      </w:pPr>
-      <w:r>
-        <w:rPr>
-          <w:rFonts w:ascii="Times New Roman" w:hAnsi="Times New Roman"/>
-        </w:rPr>
-        <w:t xml:space="preserve">                                                                 Chalco </w:t>
-      </w:r>
-      <w:proofErr w:type="spellStart"/>
-      <w:r>
-        <w:rPr>
-          <w:rFonts w:ascii="Times New Roman" w:hAnsi="Times New Roman"/>
-        </w:rPr>
-        <w:t>Tasna</w:t>
-      </w:r>
-      <w:proofErr w:type="spellEnd"/>
-      <w:r>
-        <w:rPr>
-          <w:rFonts w:ascii="Times New Roman" w:hAnsi="Times New Roman"/>
-        </w:rPr>
         <w:t xml:space="preserve"> Kenneth Mateo</w:t>
       </w:r>
     </w:p>
@@ -301,7 +293,42 @@
         <w:rPr>
           <w:rFonts w:ascii="Times New Roman" w:hAnsi="Times New Roman"/>
         </w:rPr>
-        <w:t xml:space="preserve">                                                                 Tacuri Santillan Monica Sara</w:t>
+        <w:t xml:space="preserve">                                                                 </w:t>
+      </w:r>
+      <w:r>
+        <w:rPr>
+          <w:rFonts w:ascii="Times New Roman" w:hAnsi="Times New Roman"/>
+        </w:rPr>
+        <w:t>Silva Camuendo Luis</w:t>
+      </w:r>
+      <w:r>
+        <w:rPr>
+          <w:rFonts w:ascii="Times New Roman" w:hAnsi="Times New Roman"/>
+        </w:rPr>
+        <w:t xml:space="preserve"> Alexander</w:t>
+      </w:r>
+    </w:p>
+    <w:p>
+      <w:pPr>
+        <w:spacing w:after="0" w:line="240" w:lineRule="auto"/>
+      </w:pPr>
+      <w:r>
+        <w:rPr>
+          <w:rFonts w:ascii="Times New Roman" w:hAnsi="Times New Roman"/>
+        </w:rPr>
+        <w:t xml:space="preserve">                                                                </w:t>
+      </w:r>
+      <w:r>
+        <w:rPr>
+          <w:rFonts w:ascii="Times New Roman" w:hAnsi="Times New Roman"/>
+        </w:rPr>
+        <w:t xml:space="preserve"> </w:t>
+      </w:r>
+      <w:r>
+        <w:rPr>
+          <w:rFonts w:ascii="Times New Roman" w:hAnsi="Times New Roman"/>
+        </w:rPr>
+        <w:t>Tacuri Santillan Monica Sara</w:t>
       </w:r>
     </w:p>
     <w:p>
@@ -1234,7 +1261,6 @@
           <w:b/>
           <w:bCs/>
         </w:rPr>
-        <w:lastRenderedPageBreak/>
         <w:t>¿Qué es un TDA?</w:t>
       </w:r>
     </w:p>
@@ -2349,7 +2375,6 @@
           <w:b/>
           <w:bCs/>
         </w:rPr>
-        <w:lastRenderedPageBreak/>
         <w:t>Pasos a seguir</w:t>
       </w:r>
       <w:proofErr w:type="gramEnd"/>
@@ -6306,7 +6331,6 @@
           <w:b/>
           <w:bCs/>
         </w:rPr>
-        <w:lastRenderedPageBreak/>
         <w:t>Operaciones</w:t>
       </w:r>
       <w:r>
@@ -7569,6 +7593,7 @@
         <w:rPr>
           <w:rFonts w:ascii="Times New Roman" w:hAnsi="Times New Roman"/>
         </w:rPr>
+        <w:lastRenderedPageBreak/>
         <w:t xml:space="preserve">    Mostrar Estado Final</w:t>
       </w:r>
     </w:p>
@@ -7586,7 +7611,6 @@
         <w:rPr>
           <w:rFonts w:ascii="Times New Roman" w:hAnsi="Times New Roman"/>
         </w:rPr>
-        <w:lastRenderedPageBreak/>
         <w:t>FIN</w:t>
       </w:r>
     </w:p>
@@ -9127,7 +9151,6 @@
           <w:b/>
           <w:bCs/>
         </w:rPr>
-        <w:lastRenderedPageBreak/>
         <w:t>Comparación de memoria y opción más eficiente</w:t>
       </w:r>
     </w:p>
@@ -9961,7 +9984,6 @@
           <w:b/>
           <w:bCs/>
         </w:rPr>
-        <w:lastRenderedPageBreak/>
         <w:t>Anexos</w:t>
       </w:r>
     </w:p>
@@ -14829,6 +14851,8 @@
   </w:compat>
   <w:rsids>
     <w:rsidRoot w:val="00A118D8"/>
+    <w:rsid w:val="000C2A9C"/>
+    <w:rsid w:val="0015416B"/>
     <w:rsid w:val="00203133"/>
     <w:rsid w:val="0026292A"/>
     <w:rsid w:val="00390F71"/>

</xml_diff>